<commit_message>
Edited content on word doc
</commit_message>
<xml_diff>
--- a/PowerPoint infos.docx
+++ b/PowerPoint infos.docx
@@ -5,18 +5,35 @@
     <w:p>
       <w:pPr>
         <w:jc w:val="center"/>
+        <w:rPr>
+          <w:lang w:val="en-CA"/>
+        </w:rPr>
       </w:pPr>
       <w:r>
         <w:rPr>
           <w:b/>
           <w:bCs/>
-        </w:rPr>
-        <w:t>PowerPoint infos</w:t>
-      </w:r>
+          <w:lang w:val="en-CA"/>
+        </w:rPr>
+        <w:t xml:space="preserve">PowerPoint </w:t>
+      </w:r>
+      <w:proofErr w:type="spellStart"/>
+      <w:r>
+        <w:rPr>
+          <w:b/>
+          <w:bCs/>
+          <w:lang w:val="en-CA"/>
+        </w:rPr>
+        <w:t>infos</w:t>
+      </w:r>
+      <w:proofErr w:type="spellEnd"/>
     </w:p>
     <w:p>
       <w:pPr>
         <w:jc w:val="center"/>
+        <w:rPr>
+          <w:lang w:val="en-CA"/>
+        </w:rPr>
       </w:pPr>
     </w:p>
     <w:p>
@@ -137,7 +154,25 @@
           <w:iCs/>
           <w:lang w:val="en-US"/>
         </w:rPr>
-        <w:t>Explain the vlans and why we did this</w:t>
+        <w:t xml:space="preserve">Explain the </w:t>
+      </w:r>
+      <w:proofErr w:type="spellStart"/>
+      <w:r>
+        <w:rPr>
+          <w:i/>
+          <w:iCs/>
+          <w:lang w:val="en-US"/>
+        </w:rPr>
+        <w:t>vlans</w:t>
+      </w:r>
+      <w:proofErr w:type="spellEnd"/>
+      <w:r>
+        <w:rPr>
+          <w:i/>
+          <w:iCs/>
+          <w:lang w:val="en-US"/>
+        </w:rPr>
+        <w:t xml:space="preserve"> and why we did this</w:t>
       </w:r>
     </w:p>
     <w:p>
@@ -203,45 +238,39 @@
           <w:iCs/>
           <w:lang w:val="en-US"/>
         </w:rPr>
-        <w:t>Explain VPNs and VPN added for Wifi protection (external docs working)</w:t>
-      </w:r>
-    </w:p>
-    <w:p>
-      <w:pPr>
+        <w:t xml:space="preserve">Explain VPNs and VPN added for </w:t>
+      </w:r>
+      <w:proofErr w:type="spellStart"/>
+      <w:r>
         <w:rPr>
           <w:i/>
           <w:iCs/>
           <w:lang w:val="en-US"/>
         </w:rPr>
-      </w:pPr>
-    </w:p>
-    <w:p>
-      <w:pPr>
-        <w:jc w:val="center"/>
+        <w:t>Wifi</w:t>
+      </w:r>
+      <w:proofErr w:type="spellEnd"/>
+      <w:r>
         <w:rPr>
           <w:i/>
           <w:iCs/>
           <w:lang w:val="en-US"/>
         </w:rPr>
-      </w:pPr>
-      <w:r>
+        <w:t xml:space="preserve"> protection (external docs working)</w:t>
+      </w:r>
+    </w:p>
+    <w:p>
+      <w:pPr>
         <w:rPr>
           <w:i/>
           <w:iCs/>
           <w:lang w:val="en-US"/>
         </w:rPr>
-        <w:t>Plan:</w:t>
-      </w:r>
-    </w:p>
-    <w:p>
-      <w:pPr>
-        <w:rPr>
-          <w:lang w:val="en-US"/>
-        </w:rPr>
-      </w:pPr>
-    </w:p>
-    <w:p>
-      <w:pPr>
+      </w:pPr>
+    </w:p>
+    <w:p>
+      <w:pPr>
+        <w:jc w:val="center"/>
         <w:rPr>
           <w:i/>
           <w:iCs/>
@@ -250,6 +279,30 @@
       </w:pPr>
       <w:r>
         <w:rPr>
+          <w:i/>
+          <w:iCs/>
+          <w:lang w:val="en-US"/>
+        </w:rPr>
+        <w:t>Plan:</w:t>
+      </w:r>
+    </w:p>
+    <w:p>
+      <w:pPr>
+        <w:rPr>
+          <w:lang w:val="en-US"/>
+        </w:rPr>
+      </w:pPr>
+    </w:p>
+    <w:p>
+      <w:pPr>
+        <w:rPr>
+          <w:i/>
+          <w:iCs/>
+          <w:lang w:val="en-US"/>
+        </w:rPr>
+      </w:pPr>
+      <w:r>
+        <w:rPr>
           <w:b/>
           <w:bCs/>
           <w:lang w:val="en-US"/>
@@ -276,59 +329,204 @@
     <w:p>
       <w:pPr>
         <w:rPr>
-          <w:lang w:val="en-US"/>
-        </w:rPr>
-      </w:pPr>
-      <w:r>
-        <w:rPr>
-          <w:lang w:val="en-US"/>
-        </w:rPr>
-        <w:t xml:space="preserve">Explain the situation -&gt; The original topology </w:t>
-      </w:r>
-      <w:r>
-        <w:rPr>
-          <w:lang w:val="en-US"/>
-        </w:rPr>
-        <w:t>(mesh topology for redundancy</w:t>
-      </w:r>
-      <w:r>
-        <w:rPr>
-          <w:lang w:val="en-US"/>
-        </w:rPr>
-        <w:t xml:space="preserve"> + briefly how it seems to work</w:t>
-      </w:r>
-      <w:r>
-        <w:rPr>
-          <w:lang w:val="en-US"/>
-        </w:rPr>
-        <w:t xml:space="preserve">) </w:t>
-      </w:r>
-      <w:r>
-        <w:rPr>
-          <w:lang w:val="en-US"/>
-        </w:rPr>
-        <w:t xml:space="preserve">and the interview </w:t>
-      </w:r>
-      <w:r>
-        <w:rPr>
-          <w:lang w:val="en-US"/>
-        </w:rPr>
-        <w:t>(explain their issues</w:t>
-      </w:r>
-      <w:r>
-        <w:rPr>
-          <w:lang w:val="en-US"/>
-        </w:rPr>
-        <w:t xml:space="preserve">) </w:t>
-      </w:r>
-      <w:r>
-        <w:rPr>
           <w:b/>
           <w:bCs/>
           <w:lang w:val="en-US"/>
         </w:rPr>
+      </w:pPr>
+      <w:r>
+        <w:rPr>
+          <w:lang w:val="en-US"/>
+        </w:rPr>
+        <w:t xml:space="preserve">Explain the situation -&gt; The original topology </w:t>
+      </w:r>
+      <w:r>
+        <w:rPr>
+          <w:lang w:val="en-US"/>
+        </w:rPr>
+        <w:t>(mesh topology for redundancy</w:t>
+      </w:r>
+      <w:r>
+        <w:rPr>
+          <w:lang w:val="en-US"/>
+        </w:rPr>
+        <w:t xml:space="preserve"> + briefly how it seems to work</w:t>
+      </w:r>
+      <w:r>
+        <w:rPr>
+          <w:lang w:val="en-US"/>
+        </w:rPr>
+        <w:t xml:space="preserve">) </w:t>
+      </w:r>
+      <w:r>
+        <w:rPr>
+          <w:lang w:val="en-US"/>
+        </w:rPr>
+        <w:t xml:space="preserve">and the interview </w:t>
+      </w:r>
+      <w:r>
+        <w:rPr>
+          <w:lang w:val="en-US"/>
+        </w:rPr>
+        <w:t>(explain their issues</w:t>
+      </w:r>
+      <w:r>
+        <w:rPr>
+          <w:lang w:val="en-US"/>
+        </w:rPr>
+        <w:t xml:space="preserve">) </w:t>
+      </w:r>
+      <w:r>
+        <w:rPr>
+          <w:b/>
+          <w:bCs/>
+          <w:lang w:val="en-US"/>
+        </w:rPr>
         <w:t>(INTRO?)</w:t>
       </w:r>
+    </w:p>
+    <w:p>
+      <w:pPr>
+        <w:rPr>
+          <w:b/>
+          <w:bCs/>
+          <w:lang w:val="en-US"/>
+        </w:rPr>
+      </w:pPr>
+      <w:r>
+        <w:rPr>
+          <w:b/>
+          <w:bCs/>
+          <w:lang w:val="en-US"/>
+        </w:rPr>
+        <w:t>Detailed Intro:</w:t>
+      </w:r>
+    </w:p>
+    <w:p>
+      <w:pPr>
+        <w:rPr>
+          <w:lang w:val="en-US"/>
+        </w:rPr>
+      </w:pPr>
+      <w:r>
+        <w:rPr>
+          <w:lang w:val="en-US"/>
+        </w:rPr>
+        <w:t xml:space="preserve">Hello all and thank you for coming, we are network engineers Ines Carpentier and Savannah Antoine. For this task assigned to us by </w:t>
+      </w:r>
+      <w:proofErr w:type="spellStart"/>
+      <w:r>
+        <w:rPr>
+          <w:lang w:val="en-US"/>
+        </w:rPr>
+        <w:t>HeathLife</w:t>
+      </w:r>
+      <w:proofErr w:type="spellEnd"/>
+      <w:r>
+        <w:rPr>
+          <w:lang w:val="en-US"/>
+        </w:rPr>
+        <w:t xml:space="preserve"> Specialists, we will be providing our solution for the expansion of the hospital’s network </w:t>
+      </w:r>
+      <w:r>
+        <w:rPr>
+          <w:lang w:val="en-US"/>
+        </w:rPr>
+        <w:t>infrastructure</w:t>
+      </w:r>
+      <w:r>
+        <w:rPr>
+          <w:lang w:val="en-US"/>
+        </w:rPr>
+        <w:t>.</w:t>
+      </w:r>
+    </w:p>
+    <w:p>
+      <w:pPr>
+        <w:rPr>
+          <w:lang w:val="en-US"/>
+        </w:rPr>
+      </w:pPr>
+      <w:r>
+        <w:rPr>
+          <w:lang w:val="en-US"/>
+        </w:rPr>
+        <w:t>To get a laydown of the situation we started by conducting an interview with our clients and examining the original mesh topology of the hospital.</w:t>
+      </w:r>
+    </w:p>
+    <w:p>
+      <w:pPr>
+        <w:rPr>
+          <w:lang w:val="en-US"/>
+        </w:rPr>
+      </w:pPr>
+      <w:r>
+        <w:rPr>
+          <w:lang w:val="en-US"/>
+        </w:rPr>
+        <w:t>Through our examination, we were able to deduce that while there was redundancy due to the network connections there were still some limitations. And so to ensure the successful expansion of this medical facility we identified the key issues.</w:t>
+      </w:r>
+    </w:p>
+    <w:p>
+      <w:pPr>
+        <w:rPr>
+          <w:lang w:val="en-US"/>
+        </w:rPr>
+      </w:pPr>
+      <w:r>
+        <w:rPr>
+          <w:lang w:val="en-US"/>
+        </w:rPr>
+        <w:t xml:space="preserve">These issues were linked to storage, cabling, security, and </w:t>
+      </w:r>
+      <w:proofErr w:type="spellStart"/>
+      <w:r>
+        <w:rPr>
+          <w:lang w:val="en-US"/>
+        </w:rPr>
+        <w:t>wifi</w:t>
+      </w:r>
+      <w:proofErr w:type="spellEnd"/>
+      <w:r>
+        <w:rPr>
+          <w:lang w:val="en-US"/>
+        </w:rPr>
+        <w:t>. To accommodate our client’s request for additional staff and devices we would need to purchase more materials. As such, we will elaborate more on that later on.</w:t>
+      </w:r>
+    </w:p>
+    <w:p>
+      <w:pPr>
+        <w:rPr>
+          <w:lang w:val="en-US"/>
+        </w:rPr>
+      </w:pPr>
+    </w:p>
+    <w:p>
+      <w:pPr>
+        <w:rPr>
+          <w:b/>
+          <w:bCs/>
+          <w:lang w:val="en-US"/>
+        </w:rPr>
+      </w:pPr>
+    </w:p>
+    <w:p>
+      <w:pPr>
+        <w:rPr>
+          <w:b/>
+          <w:bCs/>
+          <w:lang w:val="en-US"/>
+        </w:rPr>
+      </w:pPr>
+    </w:p>
+    <w:p>
+      <w:pPr>
+        <w:rPr>
+          <w:b/>
+          <w:bCs/>
+          <w:lang w:val="en-US"/>
+        </w:rPr>
+      </w:pPr>
     </w:p>
     <w:p>
       <w:pPr>
@@ -505,22 +703,221 @@
     <w:p>
       <w:pPr>
         <w:pStyle w:val="ListParagraph"/>
+        <w:rPr>
+          <w:u w:val="single"/>
+          <w:lang w:val="en-US"/>
+        </w:rPr>
+      </w:pPr>
+    </w:p>
+    <w:p>
+      <w:pPr>
+        <w:rPr>
+          <w:b/>
+          <w:bCs/>
+          <w:lang w:val="en-US"/>
+        </w:rPr>
+      </w:pPr>
+      <w:r>
+        <w:rPr>
+          <w:b/>
+          <w:bCs/>
+          <w:lang w:val="en-US"/>
+        </w:rPr>
+        <w:t>Cabling</w:t>
+      </w:r>
+    </w:p>
+    <w:p>
+      <w:pPr>
+        <w:pStyle w:val="ListParagraph"/>
         <w:numPr>
           <w:ilvl w:val="0"/>
           <w:numId w:val="2"/>
         </w:numPr>
         <w:rPr>
+          <w:lang w:val="en-US"/>
+        </w:rPr>
+      </w:pPr>
+      <w:r>
+        <w:rPr>
+          <w:lang w:val="en-US"/>
+        </w:rPr>
+        <w:t xml:space="preserve">Since the new location will be 12 km away from the original site upgrading the cabling is a necessity. Similar to the original topology we will be using a fiber optic cable as the primary connection between the </w:t>
+      </w:r>
+      <w:r>
+        <w:rPr>
+          <w:lang w:val="en-US"/>
+        </w:rPr>
+        <w:t>sites</w:t>
+      </w:r>
+      <w:r>
+        <w:rPr>
+          <w:lang w:val="en-US"/>
+        </w:rPr>
+        <w:t>.</w:t>
+      </w:r>
+    </w:p>
+    <w:p>
+      <w:pPr>
+        <w:pStyle w:val="ListParagraph"/>
+        <w:numPr>
+          <w:ilvl w:val="0"/>
+          <w:numId w:val="2"/>
+        </w:numPr>
+        <w:rPr>
+          <w:lang w:val="en-US"/>
+        </w:rPr>
+      </w:pPr>
+      <w:r>
+        <w:rPr>
+          <w:lang w:val="en-US"/>
+        </w:rPr>
+        <w:t xml:space="preserve">Fiber cabling is necessary due to the long transmission </w:t>
+      </w:r>
+      <w:r>
+        <w:rPr>
+          <w:lang w:val="en-US"/>
+        </w:rPr>
+        <w:t>distance;</w:t>
+      </w:r>
+      <w:r>
+        <w:rPr>
+          <w:lang w:val="en-US"/>
+        </w:rPr>
+        <w:t xml:space="preserve"> with copper cabling it would be unreliable in extended distances making fiber the better option. Fiber optic cables use light to transmit data resulting in faster, more reliable, and secure communication. Its capability is essential to a hospital environment where </w:t>
+      </w:r>
+      <w:r>
+        <w:rPr>
+          <w:lang w:val="en-US"/>
+        </w:rPr>
+        <w:t>keeping</w:t>
+      </w:r>
+      <w:r>
+        <w:rPr>
+          <w:lang w:val="en-US"/>
+        </w:rPr>
+        <w:t xml:space="preserve"> sensitive patient data and medical records protected is a top priority.</w:t>
+      </w:r>
+    </w:p>
+    <w:p>
+      <w:pPr>
+        <w:pStyle w:val="ListParagraph"/>
+        <w:rPr>
+          <w:lang w:val="en-US"/>
+        </w:rPr>
+      </w:pPr>
+    </w:p>
+    <w:p>
+      <w:pPr>
+        <w:pStyle w:val="ListParagraph"/>
+        <w:numPr>
+          <w:ilvl w:val="0"/>
+          <w:numId w:val="2"/>
+        </w:numPr>
+        <w:rPr>
+          <w:lang w:val="en-US"/>
+        </w:rPr>
+      </w:pPr>
+      <w:r>
+        <w:rPr>
+          <w:lang w:val="en-US"/>
+        </w:rPr>
+        <w:t>As you know there are many medical electronic devices in a hospital, like MRI machines, x-ray equipment</w:t>
+      </w:r>
+      <w:r>
+        <w:rPr>
+          <w:lang w:val="en-US"/>
+        </w:rPr>
+        <w:t>, and monitors</w:t>
+      </w:r>
+      <w:r>
+        <w:rPr>
+          <w:lang w:val="en-US"/>
+        </w:rPr>
+        <w:t xml:space="preserve">. These systems produce electrical magnetic </w:t>
+      </w:r>
+      <w:r>
+        <w:rPr>
+          <w:lang w:val="en-US"/>
+        </w:rPr>
+        <w:t>interferences</w:t>
+      </w:r>
+      <w:r>
+        <w:rPr>
+          <w:lang w:val="en-US"/>
+        </w:rPr>
+        <w:t xml:space="preserve">. To reduce the interferences of these signals of these EMI’S upgrading the existing cabling to shielded twisted pair CAT 6 or higher is a necessity. By using STP’S it will address </w:t>
+      </w:r>
+      <w:r>
+        <w:rPr>
+          <w:lang w:val="en-US"/>
+        </w:rPr>
+        <w:t>our</w:t>
+      </w:r>
+      <w:r>
+        <w:rPr>
+          <w:lang w:val="en-US"/>
+        </w:rPr>
+        <w:t xml:space="preserve"> client’s issues regarding lags during large transmissions of data. As the current cabling’s </w:t>
+      </w:r>
+      <w:r>
+        <w:rPr>
+          <w:lang w:val="en-US"/>
+        </w:rPr>
+        <w:t>bandwidth</w:t>
+      </w:r>
+      <w:r>
+        <w:rPr>
+          <w:lang w:val="en-US"/>
+        </w:rPr>
+        <w:t xml:space="preserve"> is </w:t>
+      </w:r>
+      <w:r>
+        <w:rPr>
+          <w:lang w:val="en-US"/>
+        </w:rPr>
+        <w:t>incapable</w:t>
+      </w:r>
+      <w:r>
+        <w:rPr>
+          <w:lang w:val="en-US"/>
+        </w:rPr>
+        <w:t xml:space="preserve"> of handling large amounts of data while still operating at high speeds. STP’s will increase network performance and </w:t>
+      </w:r>
+      <w:r>
+        <w:rPr>
+          <w:lang w:val="en-US"/>
+        </w:rPr>
+        <w:t>reliability</w:t>
+      </w:r>
+      <w:r>
+        <w:rPr>
+          <w:lang w:val="en-US"/>
+        </w:rPr>
+        <w:t xml:space="preserve"> as STP cat 6 can carry 10gbps.</w:t>
+      </w:r>
+    </w:p>
+    <w:p>
+      <w:pPr>
+        <w:ind w:left="360"/>
+        <w:rPr>
           <w:u w:val="single"/>
           <w:lang w:val="en-US"/>
         </w:rPr>
       </w:pPr>
-      <w:r>
-        <w:rPr>
-          <w:u w:val="single"/>
-          <w:lang w:val="en-US"/>
-        </w:rPr>
-        <w:t>Cost summary</w:t>
-      </w:r>
+    </w:p>
+    <w:p>
+      <w:pPr>
+        <w:rPr>
+          <w:lang w:val="en-US"/>
+        </w:rPr>
+      </w:pPr>
+    </w:p>
+    <w:p>
+      <w:pPr>
+        <w:rPr>
+          <w:lang w:val="en-US"/>
+        </w:rPr>
+      </w:pPr>
     </w:p>
     <w:p>
       <w:pPr>
@@ -585,6 +982,7 @@
         <w:rPr>
           <w:lang w:val="en-US"/>
         </w:rPr>
+        <w:lastRenderedPageBreak/>
         <w:t>Change the storage space of the NAS (based on interview)</w:t>
       </w:r>
       <w:r>
@@ -662,7 +1060,6 @@
         <w:rPr>
           <w:lang w:val="en-US"/>
         </w:rPr>
-        <w:lastRenderedPageBreak/>
         <w:t>Explain how we placed the TFTP and users too</w:t>
       </w:r>
       <w:r>
@@ -686,26 +1083,6 @@
           <w:lang w:val="en-US"/>
         </w:rPr>
         <w:t xml:space="preserve"> </w:t>
-      </w:r>
-    </w:p>
-    <w:p>
-      <w:pPr>
-        <w:pStyle w:val="ListParagraph"/>
-        <w:numPr>
-          <w:ilvl w:val="0"/>
-          <w:numId w:val="3"/>
-        </w:numPr>
-        <w:rPr>
-          <w:u w:val="single"/>
-          <w:lang w:val="en-US"/>
-        </w:rPr>
-      </w:pPr>
-      <w:r>
-        <w:rPr>
-          <w:u w:val="single"/>
-          <w:lang w:val="en-US"/>
-        </w:rPr>
-        <w:t>Cost summary</w:t>
       </w:r>
     </w:p>
     <w:p>
@@ -866,22 +1243,496 @@
     </w:p>
     <w:p>
       <w:pPr>
-        <w:pStyle w:val="ListParagraph"/>
-        <w:numPr>
-          <w:ilvl w:val="0"/>
-          <w:numId w:val="4"/>
-        </w:numPr>
-        <w:rPr>
-          <w:u w:val="single"/>
-          <w:lang w:val="en-US"/>
-        </w:rPr>
-      </w:pPr>
-      <w:r>
-        <w:rPr>
-          <w:u w:val="single"/>
-          <w:lang w:val="en-US"/>
-        </w:rPr>
-        <w:t>Cost summary</w:t>
+        <w:rPr>
+          <w:lang w:val="en-US"/>
+        </w:rPr>
+      </w:pPr>
+    </w:p>
+    <w:p>
+      <w:pPr>
+        <w:rPr>
+          <w:b/>
+          <w:bCs/>
+          <w:lang w:val="en-US"/>
+        </w:rPr>
+      </w:pPr>
+      <w:r>
+        <w:rPr>
+          <w:b/>
+          <w:bCs/>
+          <w:lang w:val="en-US"/>
+        </w:rPr>
+        <w:t>The Main Network</w:t>
+      </w:r>
+    </w:p>
+    <w:p>
+      <w:pPr>
+        <w:rPr>
+          <w:lang w:val="en-US"/>
+        </w:rPr>
+      </w:pPr>
+      <w:r>
+        <w:rPr>
+          <w:lang w:val="en-US"/>
+        </w:rPr>
+        <w:t>VLSM</w:t>
+      </w:r>
+    </w:p>
+    <w:p>
+      <w:pPr>
+        <w:rPr>
+          <w:lang w:val="en-US"/>
+        </w:rPr>
+      </w:pPr>
+      <w:r>
+        <w:rPr>
+          <w:lang w:val="en-US"/>
+        </w:rPr>
+        <w:t xml:space="preserve">For the main network we kept the </w:t>
+      </w:r>
+      <w:proofErr w:type="spellStart"/>
+      <w:r>
+        <w:rPr>
+          <w:lang w:val="en-US"/>
+        </w:rPr>
+        <w:t>vlsm</w:t>
+      </w:r>
+      <w:proofErr w:type="spellEnd"/>
+      <w:r>
+        <w:rPr>
+          <w:lang w:val="en-US"/>
+        </w:rPr>
+        <w:t xml:space="preserve"> approach but adjusted the range of the available host </w:t>
+      </w:r>
+      <w:proofErr w:type="spellStart"/>
+      <w:r>
+        <w:rPr>
+          <w:lang w:val="en-US"/>
+        </w:rPr>
+        <w:t>ips</w:t>
+      </w:r>
+      <w:proofErr w:type="spellEnd"/>
+      <w:r>
+        <w:rPr>
+          <w:lang w:val="en-US"/>
+        </w:rPr>
+        <w:t xml:space="preserve"> to accommodate the additional staff and guest network.</w:t>
+      </w:r>
+      <w:r>
+        <w:rPr>
+          <w:lang w:val="en-US"/>
+        </w:rPr>
+        <w:t xml:space="preserve"> </w:t>
+      </w:r>
+      <w:r>
+        <w:rPr>
+          <w:lang w:val="en-US"/>
+        </w:rPr>
+        <w:t>VLSM is fundamenta</w:t>
+      </w:r>
+      <w:r>
+        <w:rPr>
+          <w:lang w:val="en-US"/>
+        </w:rPr>
+        <w:t xml:space="preserve">l </w:t>
+      </w:r>
+      <w:r>
+        <w:rPr>
+          <w:lang w:val="en-US"/>
+        </w:rPr>
+        <w:t xml:space="preserve">in saving unused </w:t>
+      </w:r>
+      <w:proofErr w:type="spellStart"/>
+      <w:r>
+        <w:rPr>
+          <w:lang w:val="en-US"/>
+        </w:rPr>
+        <w:t>ip</w:t>
+      </w:r>
+      <w:proofErr w:type="spellEnd"/>
+      <w:r>
+        <w:rPr>
+          <w:lang w:val="en-US"/>
+        </w:rPr>
+        <w:t xml:space="preserve"> addresses and only using the required amount based on our host estimations.</w:t>
+      </w:r>
+      <w:r>
+        <w:rPr>
+          <w:lang w:val="en-US"/>
+        </w:rPr>
+        <w:t xml:space="preserve"> This saves money and </w:t>
+      </w:r>
+      <w:r>
+        <w:rPr>
+          <w:lang w:val="en-US"/>
+        </w:rPr>
+        <w:t>time</w:t>
+      </w:r>
+      <w:r>
+        <w:rPr>
+          <w:lang w:val="en-US"/>
+        </w:rPr>
+        <w:t xml:space="preserve"> while still allowing us to configure </w:t>
+      </w:r>
+      <w:proofErr w:type="spellStart"/>
+      <w:r>
+        <w:rPr>
+          <w:lang w:val="en-US"/>
+        </w:rPr>
+        <w:t>dhcp</w:t>
+      </w:r>
+      <w:proofErr w:type="spellEnd"/>
+      <w:r>
+        <w:rPr>
+          <w:lang w:val="en-US"/>
+        </w:rPr>
+        <w:t xml:space="preserve"> for our main network.</w:t>
+      </w:r>
+    </w:p>
+    <w:p>
+      <w:pPr>
+        <w:rPr>
+          <w:lang w:val="en-US"/>
+        </w:rPr>
+      </w:pPr>
+      <w:r>
+        <w:rPr>
+          <w:lang w:val="en-US"/>
+        </w:rPr>
+        <w:t>VPN and FIREWALL</w:t>
+      </w:r>
+    </w:p>
+    <w:p>
+      <w:pPr>
+        <w:rPr>
+          <w:lang w:val="en-US"/>
+        </w:rPr>
+      </w:pPr>
+      <w:r>
+        <w:rPr>
+          <w:lang w:val="en-US"/>
+        </w:rPr>
+        <w:t xml:space="preserve">For additional security implementing a firewall and </w:t>
+      </w:r>
+      <w:proofErr w:type="spellStart"/>
+      <w:r>
+        <w:rPr>
+          <w:lang w:val="en-US"/>
+        </w:rPr>
+        <w:t>vpn</w:t>
+      </w:r>
+      <w:proofErr w:type="spellEnd"/>
+      <w:r>
+        <w:rPr>
+          <w:lang w:val="en-US"/>
+        </w:rPr>
+        <w:t xml:space="preserve"> is essential. By creating a </w:t>
+      </w:r>
+      <w:proofErr w:type="spellStart"/>
+      <w:r>
+        <w:rPr>
+          <w:lang w:val="en-US"/>
+        </w:rPr>
+        <w:t>vpn</w:t>
+      </w:r>
+      <w:proofErr w:type="spellEnd"/>
+      <w:r>
+        <w:rPr>
+          <w:lang w:val="en-US"/>
+        </w:rPr>
+        <w:t xml:space="preserve"> tunnel between the routers this will create a secure connection within the hospital. The firewall will also protect the hospital from </w:t>
+      </w:r>
+      <w:r>
+        <w:rPr>
+          <w:lang w:val="en-US"/>
+        </w:rPr>
+        <w:t>incoming</w:t>
+      </w:r>
+      <w:r>
+        <w:rPr>
+          <w:lang w:val="en-US"/>
+        </w:rPr>
+        <w:t xml:space="preserve"> traffic as it will detect any suspicious activity and block the connection.</w:t>
+      </w:r>
+    </w:p>
+    <w:p>
+      <w:pPr>
+        <w:rPr>
+          <w:lang w:val="en-US"/>
+        </w:rPr>
+      </w:pPr>
+      <w:r>
+        <w:rPr>
+          <w:lang w:val="en-US"/>
+        </w:rPr>
+        <w:t>VLAN</w:t>
+      </w:r>
+    </w:p>
+    <w:p>
+      <w:pPr>
+        <w:rPr>
+          <w:lang w:val="en-US"/>
+        </w:rPr>
+      </w:pPr>
+      <w:r>
+        <w:rPr>
+          <w:lang w:val="en-US"/>
+        </w:rPr>
+        <w:t xml:space="preserve">By using </w:t>
+      </w:r>
+      <w:proofErr w:type="spellStart"/>
+      <w:r>
+        <w:rPr>
+          <w:lang w:val="en-US"/>
+        </w:rPr>
+        <w:t>intervlan</w:t>
+      </w:r>
+      <w:proofErr w:type="spellEnd"/>
+      <w:r>
+        <w:rPr>
+          <w:lang w:val="en-US"/>
+        </w:rPr>
+        <w:t xml:space="preserve"> routing we were able to connect </w:t>
+      </w:r>
+      <w:r>
+        <w:rPr>
+          <w:lang w:val="en-US"/>
+        </w:rPr>
+        <w:t xml:space="preserve">the </w:t>
+      </w:r>
+      <w:r>
+        <w:rPr>
+          <w:lang w:val="en-US"/>
+        </w:rPr>
+        <w:t>7 seven</w:t>
+      </w:r>
+      <w:r>
+        <w:rPr>
+          <w:lang w:val="en-US"/>
+        </w:rPr>
+        <w:t xml:space="preserve"> created</w:t>
+      </w:r>
+      <w:r>
+        <w:rPr>
+          <w:lang w:val="en-US"/>
+        </w:rPr>
+        <w:t xml:space="preserve"> </w:t>
+      </w:r>
+      <w:proofErr w:type="spellStart"/>
+      <w:r>
+        <w:rPr>
+          <w:lang w:val="en-US"/>
+        </w:rPr>
+        <w:t>vlans</w:t>
+      </w:r>
+      <w:proofErr w:type="spellEnd"/>
+      <w:r>
+        <w:rPr>
+          <w:lang w:val="en-US"/>
+        </w:rPr>
+        <w:t xml:space="preserve"> and allow each one to communicate with each other. This is important </w:t>
+      </w:r>
+      <w:r>
+        <w:rPr>
+          <w:lang w:val="en-US"/>
+        </w:rPr>
+        <w:t>as</w:t>
+      </w:r>
+      <w:r>
+        <w:rPr>
+          <w:lang w:val="en-US"/>
+        </w:rPr>
+        <w:t xml:space="preserve"> the </w:t>
+      </w:r>
+      <w:r>
+        <w:rPr>
+          <w:lang w:val="en-US"/>
+        </w:rPr>
+        <w:t>departments</w:t>
+      </w:r>
+      <w:r>
+        <w:rPr>
+          <w:lang w:val="en-US"/>
+        </w:rPr>
+        <w:t xml:space="preserve"> are divided with 5 allocated to the staff like admin/reception, IT, Lab-Techs, doctors, and nurses, we have one voice </w:t>
+      </w:r>
+      <w:proofErr w:type="spellStart"/>
+      <w:r>
+        <w:rPr>
+          <w:lang w:val="en-US"/>
+        </w:rPr>
+        <w:t>vlan</w:t>
+      </w:r>
+      <w:proofErr w:type="spellEnd"/>
+      <w:r>
+        <w:rPr>
+          <w:lang w:val="en-US"/>
+        </w:rPr>
+        <w:t xml:space="preserve"> for </w:t>
+      </w:r>
+      <w:proofErr w:type="spellStart"/>
+      <w:r>
+        <w:rPr>
+          <w:lang w:val="en-US"/>
+        </w:rPr>
+        <w:t>ip</w:t>
+      </w:r>
+      <w:proofErr w:type="spellEnd"/>
+      <w:r>
+        <w:rPr>
+          <w:lang w:val="en-US"/>
+        </w:rPr>
+        <w:t xml:space="preserve"> phones, and another </w:t>
+      </w:r>
+      <w:proofErr w:type="spellStart"/>
+      <w:r>
+        <w:rPr>
+          <w:lang w:val="en-US"/>
+        </w:rPr>
+        <w:t>vlan</w:t>
+      </w:r>
+      <w:proofErr w:type="spellEnd"/>
+      <w:r>
+        <w:rPr>
+          <w:lang w:val="en-US"/>
+        </w:rPr>
+        <w:t xml:space="preserve"> for our servers and storage devices.</w:t>
+      </w:r>
+    </w:p>
+    <w:p>
+      <w:pPr>
+        <w:rPr>
+          <w:lang w:val="en-US"/>
+        </w:rPr>
+      </w:pPr>
+      <w:r>
+        <w:rPr>
+          <w:lang w:val="en-US"/>
+        </w:rPr>
+        <w:t>WIFI</w:t>
+      </w:r>
+    </w:p>
+    <w:p>
+      <w:pPr>
+        <w:rPr>
+          <w:lang w:val="en-US"/>
+        </w:rPr>
+      </w:pPr>
+      <w:r>
+        <w:rPr>
+          <w:lang w:val="en-US"/>
+        </w:rPr>
+        <w:t xml:space="preserve">Our plan also </w:t>
+      </w:r>
+      <w:r>
+        <w:rPr>
+          <w:lang w:val="en-US"/>
+        </w:rPr>
+        <w:t>includes</w:t>
+      </w:r>
+      <w:r>
+        <w:rPr>
+          <w:lang w:val="en-US"/>
+        </w:rPr>
+        <w:t xml:space="preserve"> the incorporation of WIFI as per our clients request. We made a password protected </w:t>
+      </w:r>
+      <w:proofErr w:type="spellStart"/>
+      <w:r>
+        <w:rPr>
+          <w:lang w:val="en-US"/>
+        </w:rPr>
+        <w:t>wifi</w:t>
+      </w:r>
+      <w:proofErr w:type="spellEnd"/>
+      <w:r>
+        <w:rPr>
+          <w:lang w:val="en-US"/>
+        </w:rPr>
+        <w:t xml:space="preserve"> connection for the staff to </w:t>
+      </w:r>
+      <w:r>
+        <w:rPr>
+          <w:lang w:val="en-US"/>
+        </w:rPr>
+        <w:t>connect</w:t>
+      </w:r>
+      <w:r>
+        <w:rPr>
+          <w:lang w:val="en-US"/>
+        </w:rPr>
+        <w:t xml:space="preserve"> securely on their tablets. Having this password protected </w:t>
+      </w:r>
+      <w:proofErr w:type="spellStart"/>
+      <w:r>
+        <w:rPr>
+          <w:lang w:val="en-US"/>
+        </w:rPr>
+        <w:t>wifi</w:t>
+      </w:r>
+      <w:proofErr w:type="spellEnd"/>
+      <w:r>
+        <w:rPr>
+          <w:lang w:val="en-US"/>
+        </w:rPr>
+        <w:t xml:space="preserve"> connection will block guest access </w:t>
+      </w:r>
+      <w:r>
+        <w:rPr>
+          <w:lang w:val="en-US"/>
+        </w:rPr>
+        <w:t>and</w:t>
+      </w:r>
+      <w:r>
+        <w:rPr>
+          <w:lang w:val="en-US"/>
+        </w:rPr>
+        <w:t xml:space="preserve"> they will have their own separate network.</w:t>
+      </w:r>
+    </w:p>
+    <w:p>
+      <w:pPr>
+        <w:rPr>
+          <w:lang w:val="en-US"/>
+        </w:rPr>
+      </w:pPr>
+      <w:r>
+        <w:rPr>
+          <w:lang w:val="en-US"/>
+        </w:rPr>
+        <w:lastRenderedPageBreak/>
+        <w:t>An access point will also be implemented to create this wireless connection. Our DHCP configuration will automatically assign an Ip once the hospital staff member is connected to the network.</w:t>
+      </w:r>
+    </w:p>
+    <w:p>
+      <w:pPr>
+        <w:rPr>
+          <w:lang w:val="en-US"/>
+        </w:rPr>
+      </w:pPr>
+      <w:r>
+        <w:rPr>
+          <w:lang w:val="en-US"/>
+        </w:rPr>
+        <w:t>Costs</w:t>
+      </w:r>
+      <w:r>
+        <w:rPr>
+          <w:lang w:val="en-US"/>
+        </w:rPr>
+        <w:t xml:space="preserve"> Summary</w:t>
+      </w:r>
+    </w:p>
+    <w:p>
+      <w:pPr>
+        <w:rPr>
+          <w:lang w:val="en-US"/>
+        </w:rPr>
+      </w:pPr>
+      <w:r>
+        <w:rPr>
+          <w:lang w:val="en-US"/>
+        </w:rPr>
+        <w:t>For our additional tech devices, we have access points, desktops, tablets, fiberoptic cabling, shielded twisted pair cat 6 cabling, and other connective components. We’ve estimated a total cost range from $20,000 to $60, 000 CAD based on the requirements.</w:t>
       </w:r>
     </w:p>
     <w:p>
@@ -1187,6 +2038,24 @@
           </mc:Fallback>
         </mc:AlternateContent>
       </w:r>
+    </w:p>
+    <w:p>
+      <w:pPr>
+        <w:rPr>
+          <w:b/>
+          <w:bCs/>
+          <w:lang w:val="en-US"/>
+        </w:rPr>
+      </w:pPr>
+    </w:p>
+    <w:p>
+      <w:pPr>
+        <w:rPr>
+          <w:b/>
+          <w:bCs/>
+          <w:lang w:val="en-US"/>
+        </w:rPr>
+      </w:pPr>
     </w:p>
     <w:sectPr>
       <w:pgSz w:w="11906" w:h="16838"/>

</xml_diff>